<commit_message>
Rename to MNCloud, part of Mundus Novus
New icons and palette, cloud.mundusnovus.org (the old address redirects),
the MNCloud desktop app (mncloud), share records under org.mundusnovus,
and the Mundus Novus License.

Co-Authored-By: Claude Opus 5.5 <noreply@anthropic.com>
</commit_message>
<xml_diff>
--- a/templates/blank.docx
+++ b/templates/blank.docx
@@ -264,14 +264,14 @@
     </a:clrScheme>
     <a:fontScheme name="Office Classic 2">
       <a:majorFont>
-        <a:latin typeface="Christian Sans"/>
-        <a:ea typeface="Christian Sans"/>
-        <a:cs typeface="Christian Sans"/>
+        <a:latin typeface="Novus Serif"/>
+        <a:ea typeface="Novus Serif"/>
+        <a:cs typeface="Novus Serif"/>
       </a:majorFont>
       <a:minorFont>
-        <a:latin typeface="Christian Sans"/>
-        <a:ea typeface="Christian Sans"/>
-        <a:cs typeface="Christian Sans"/>
+        <a:latin typeface="Novus Serif"/>
+        <a:ea typeface="Novus Serif"/>
+        <a:cs typeface="Novus Serif"/>
       </a:minorFont>
     </a:fontScheme>
     <a:fmtScheme name="Office">

</xml_diff>

<commit_message>
Rename to Asteria Cloud, part of Asteria Technology
New name, asteria.technology addresses, the teal palette and the new icons,
fonts renamed Asteria Pixel and Asteria Serif, and the Asteria License.
Settings and files saved under the earlier names still load.

Co-Authored-By: Claude Opus 5.5 <noreply@anthropic.com>
</commit_message>
<xml_diff>
--- a/templates/blank.docx
+++ b/templates/blank.docx
@@ -264,14 +264,14 @@
     </a:clrScheme>
     <a:fontScheme name="Office Classic 2">
       <a:majorFont>
-        <a:latin typeface="Novus Serif"/>
-        <a:ea typeface="Novus Serif"/>
-        <a:cs typeface="Novus Serif"/>
+        <a:latin typeface="Asteria Serif"/>
+        <a:ea typeface="Asteria Serif"/>
+        <a:cs typeface="Asteria Serif"/>
       </a:majorFont>
       <a:minorFont>
-        <a:latin typeface="Novus Serif"/>
-        <a:ea typeface="Novus Serif"/>
-        <a:cs typeface="Novus Serif"/>
+        <a:latin typeface="Asteria Serif"/>
+        <a:ea typeface="Asteria Serif"/>
+        <a:cs typeface="Asteria Serif"/>
       </a:minorFont>
     </a:fontScheme>
     <a:fmtScheme name="Office">

</xml_diff>